<commit_message>
aggiornamento documenti e commenti
</commit_message>
<xml_diff>
--- a/documentazione/Progetto commit_final.docx
+++ b/documentazione/Progetto commit_final.docx
@@ -162,15 +162,24 @@
           <w:sz w:val="40"/>
           <w:szCs w:val="40"/>
         </w:rPr>
-        <w:t>Stato aggiornamento:  2</w:t>
-      </w:r>
+        <w:t xml:space="preserve">Stato </w:t>
+      </w:r>
+      <w:proofErr w:type="gramStart"/>
       <w:r>
         <w:rPr>
           <w:sz w:val="40"/>
           <w:szCs w:val="40"/>
         </w:rPr>
+        <w:t>aggiornamento:  2</w:t>
+      </w:r>
+      <w:r>
+        <w:rPr>
+          <w:sz w:val="40"/>
+          <w:szCs w:val="40"/>
+        </w:rPr>
         <w:t>2</w:t>
       </w:r>
+      <w:proofErr w:type="gramEnd"/>
       <w:r>
         <w:rPr>
           <w:sz w:val="40"/>
@@ -1107,7 +1116,14 @@
           <w:rFonts w:ascii="Calibri" w:eastAsia="Calibri" w:hAnsi="Calibri" w:cs="Calibri"/>
         </w:rPr>
         <w:tab/>
-        <w:t xml:space="preserve">backup/  </w:t>
+        <w:t>backup</w:t>
+      </w:r>
+      <w:proofErr w:type="gramStart"/>
+      <w:r>
+        <w:rPr>
+          <w:rFonts w:ascii="Calibri" w:eastAsia="Calibri" w:hAnsi="Calibri" w:cs="Calibri"/>
+        </w:rPr>
+        <w:t xml:space="preserve">/  </w:t>
       </w:r>
       <w:proofErr w:type="spellStart"/>
       <w:r>
@@ -1117,6 +1133,7 @@
         <w:t>config</w:t>
       </w:r>
       <w:proofErr w:type="spellEnd"/>
+      <w:proofErr w:type="gramEnd"/>
       <w:r>
         <w:rPr>
           <w:rFonts w:ascii="Calibri" w:eastAsia="Calibri" w:hAnsi="Calibri" w:cs="Calibri"/>
@@ -1798,19 +1815,43 @@
         <w:ind w:left="18" w:right="2409"/>
       </w:pPr>
       <w:proofErr w:type="spellStart"/>
+      <w:proofErr w:type="gramStart"/>
       <w:r>
         <w:rPr>
           <w:rFonts w:ascii="Calibri" w:eastAsia="Calibri" w:hAnsi="Calibri" w:cs="Calibri"/>
         </w:rPr>
-        <w:t>file;dimensione;ultima_modifica;backup</w:t>
+        <w:t>file;dimensione</w:t>
+      </w:r>
+      <w:proofErr w:type="gramEnd"/>
+      <w:r>
+        <w:rPr>
+          <w:rFonts w:ascii="Calibri" w:eastAsia="Calibri" w:hAnsi="Calibri" w:cs="Calibri"/>
+        </w:rPr>
+        <w:t>;ultima_</w:t>
+      </w:r>
+      <w:proofErr w:type="gramStart"/>
+      <w:r>
+        <w:rPr>
+          <w:rFonts w:ascii="Calibri" w:eastAsia="Calibri" w:hAnsi="Calibri" w:cs="Calibri"/>
+        </w:rPr>
+        <w:t>modifica;backup</w:t>
       </w:r>
       <w:proofErr w:type="spellEnd"/>
+      <w:proofErr w:type="gramEnd"/>
       <w:r>
         <w:rPr>
           <w:rFonts w:ascii="Calibri" w:eastAsia="Calibri" w:hAnsi="Calibri" w:cs="Calibri"/>
         </w:rPr>
-        <w:t xml:space="preserve"> clienti.csv;245;2026-05-18 21:15;OK</w:t>
-      </w:r>
+        <w:t xml:space="preserve"> clienti.csv;245;2026-05-18 </w:t>
+      </w:r>
+      <w:proofErr w:type="gramStart"/>
+      <w:r>
+        <w:rPr>
+          <w:rFonts w:ascii="Calibri" w:eastAsia="Calibri" w:hAnsi="Calibri" w:cs="Calibri"/>
+        </w:rPr>
+        <w:t>21:15;OK</w:t>
+      </w:r>
+      <w:proofErr w:type="gramEnd"/>
     </w:p>
     <w:p>
       <w:pPr>
@@ -3503,11 +3544,19 @@
       </w:r>
       <w:proofErr w:type="spellStart"/>
       <w:r>
-        <w:t>scrivi_log</w:t>
+        <w:t>scrivi_</w:t>
+      </w:r>
+      <w:proofErr w:type="gramStart"/>
+      <w:r>
+        <w:t>log</w:t>
       </w:r>
       <w:proofErr w:type="spellEnd"/>
       <w:r>
-        <w:t xml:space="preserve">(); </w:t>
+        <w:t>(</w:t>
+      </w:r>
+      <w:proofErr w:type="gramEnd"/>
+      <w:r>
+        <w:t xml:space="preserve">); </w:t>
       </w:r>
     </w:p>
     <w:p>
@@ -3522,12 +3571,17 @@
         <w:t xml:space="preserve">funzione </w:t>
       </w:r>
       <w:proofErr w:type="spellStart"/>
+      <w:proofErr w:type="gramStart"/>
       <w:r>
         <w:t>main</w:t>
       </w:r>
       <w:proofErr w:type="spellEnd"/>
       <w:r>
-        <w:t xml:space="preserve">(); </w:t>
+        <w:t>(</w:t>
+      </w:r>
+      <w:proofErr w:type="gramEnd"/>
+      <w:r>
+        <w:t xml:space="preserve">); </w:t>
       </w:r>
     </w:p>
     <w:p>
@@ -5281,11 +5335,19 @@
     <w:p>
       <w:proofErr w:type="spellStart"/>
       <w:r>
-        <w:t>monitora_cartella</w:t>
+        <w:t>monitora_</w:t>
+      </w:r>
+      <w:proofErr w:type="gramStart"/>
+      <w:r>
+        <w:t>cartella</w:t>
       </w:r>
       <w:proofErr w:type="spellEnd"/>
       <w:r>
-        <w:t>()</w:t>
+        <w:t>(</w:t>
+      </w:r>
+      <w:proofErr w:type="gramEnd"/>
+      <w:r>
+        <w:t>)</w:t>
       </w:r>
     </w:p>
     <w:p>
@@ -5293,12 +5355,17 @@
         <w:t xml:space="preserve">per separare la logica di monitoraggio dalla funzione principale </w:t>
       </w:r>
       <w:proofErr w:type="spellStart"/>
+      <w:proofErr w:type="gramStart"/>
       <w:r>
         <w:t>main</w:t>
       </w:r>
       <w:proofErr w:type="spellEnd"/>
       <w:r>
-        <w:t>().</w:t>
+        <w:t>(</w:t>
+      </w:r>
+      <w:proofErr w:type="gramEnd"/>
+      <w:r>
+        <w:t>).</w:t>
       </w:r>
     </w:p>
     <w:p>
@@ -5598,7 +5665,23 @@
           <w:sz w:val="20"/>
           <w:szCs w:val="20"/>
         </w:rPr>
-        <w:t xml:space="preserve"> abbiamo riscontrato errori sul percorso log. Abbiamo di nuovo  chiesto aiuto a </w:t>
+        <w:t xml:space="preserve"> abbiamo riscontrato errori sul percorso log. Abbiamo di </w:t>
+      </w:r>
+      <w:proofErr w:type="gramStart"/>
+      <w:r>
+        <w:rPr>
+          <w:sz w:val="20"/>
+          <w:szCs w:val="20"/>
+        </w:rPr>
+        <w:t>nuovo  chiesto</w:t>
+      </w:r>
+      <w:proofErr w:type="gramEnd"/>
+      <w:r>
+        <w:rPr>
+          <w:sz w:val="20"/>
+          <w:szCs w:val="20"/>
+        </w:rPr>
+        <w:t xml:space="preserve"> aiuto a </w:t>
       </w:r>
       <w:proofErr w:type="spellStart"/>
       <w:r>
@@ -5623,6 +5706,7 @@
         </w:rPr>
         <w:t xml:space="preserve"> </w:t>
       </w:r>
+      <w:proofErr w:type="gramStart"/>
       <w:r>
         <w:rPr>
           <w:sz w:val="20"/>
@@ -5630,6 +5714,7 @@
         </w:rPr>
         <w:t>Bellini..</w:t>
       </w:r>
+      <w:proofErr w:type="gramEnd"/>
     </w:p>
     <w:p>
       <w:pPr>
@@ -5689,9 +5774,36 @@
           <w:lang w:eastAsia="it-IT"/>
           <w14:ligatures w14:val="none"/>
         </w:rPr>
-        <w:t xml:space="preserve"> e , sorpresa.... errore poiché il programma non trova cartella log in </w:t>
+        <w:t xml:space="preserve"> </w:t>
+      </w:r>
+      <w:proofErr w:type="gramStart"/>
+      <w:r>
+        <w:rPr>
+          <w:rFonts w:ascii="Arial" w:eastAsia="Times New Roman" w:hAnsi="Arial" w:cs="Arial"/>
+          <w:color w:val="2F5496" w:themeColor="accent1" w:themeShade="BF"/>
+          <w:kern w:val="0"/>
+          <w:sz w:val="20"/>
+          <w:szCs w:val="20"/>
+          <w:lang w:eastAsia="it-IT"/>
+          <w14:ligatures w14:val="none"/>
+        </w:rPr>
+        <w:t>e ,</w:t>
+      </w:r>
+      <w:proofErr w:type="gramEnd"/>
+      <w:r>
+        <w:rPr>
+          <w:rFonts w:ascii="Arial" w:eastAsia="Times New Roman" w:hAnsi="Arial" w:cs="Arial"/>
+          <w:color w:val="2F5496" w:themeColor="accent1" w:themeShade="BF"/>
+          <w:kern w:val="0"/>
+          <w:sz w:val="20"/>
+          <w:szCs w:val="20"/>
+          <w:lang w:eastAsia="it-IT"/>
+          <w14:ligatures w14:val="none"/>
+        </w:rPr>
+        <w:t xml:space="preserve"> sorpresa.... errore poiché il programma non trova cartella log in </w:t>
       </w:r>
       <w:proofErr w:type="spellStart"/>
+      <w:proofErr w:type="gramStart"/>
       <w:r>
         <w:rPr>
           <w:rFonts w:ascii="Arial" w:eastAsia="Times New Roman" w:hAnsi="Arial" w:cs="Arial"/>
@@ -5715,7 +5827,20 @@
           <w:lang w:eastAsia="it-IT"/>
           <w14:ligatures w14:val="none"/>
         </w:rPr>
-        <w:t>..... ti allego il codice e mi sembra che sia un problema di percorsi ma non sono riuscito a risolvere"""</w:t>
+        <w:t>....</w:t>
+      </w:r>
+      <w:proofErr w:type="gramEnd"/>
+      <w:r>
+        <w:rPr>
+          <w:rFonts w:ascii="Arial" w:eastAsia="Times New Roman" w:hAnsi="Arial" w:cs="Arial"/>
+          <w:color w:val="2F5496" w:themeColor="accent1" w:themeShade="BF"/>
+          <w:kern w:val="0"/>
+          <w:sz w:val="20"/>
+          <w:szCs w:val="20"/>
+          <w:lang w:eastAsia="it-IT"/>
+          <w14:ligatures w14:val="none"/>
+        </w:rPr>
+        <w:t>. ti allego il codice e mi sembra che sia un problema di percorsi ma non sono riuscito a risolvere"""</w:t>
       </w:r>
     </w:p>
     <w:p>
@@ -5924,7 +6049,20 @@
           <w:lang w:eastAsia="it-IT"/>
           <w14:ligatures w14:val="none"/>
         </w:rPr>
-        <w:t>scrivi_log</w:t>
+        <w:t>scrivi_</w:t>
+      </w:r>
+      <w:proofErr w:type="gramStart"/>
+      <w:r>
+        <w:rPr>
+          <w:rFonts w:ascii="Arial" w:eastAsia="Times New Roman" w:hAnsi="Arial" w:cs="Arial"/>
+          <w:color w:val="2F5496" w:themeColor="accent1" w:themeShade="BF"/>
+          <w:kern w:val="0"/>
+          <w:sz w:val="20"/>
+          <w:szCs w:val="20"/>
+          <w:lang w:eastAsia="it-IT"/>
+          <w14:ligatures w14:val="none"/>
+        </w:rPr>
+        <w:t>log</w:t>
       </w:r>
       <w:proofErr w:type="spellEnd"/>
       <w:r>
@@ -5937,7 +6075,20 @@
           <w:lang w:eastAsia="it-IT"/>
           <w14:ligatures w14:val="none"/>
         </w:rPr>
-        <w:t xml:space="preserve">("Programma avviato", </w:t>
+        <w:t>(</w:t>
+      </w:r>
+      <w:proofErr w:type="gramEnd"/>
+      <w:r>
+        <w:rPr>
+          <w:rFonts w:ascii="Arial" w:eastAsia="Times New Roman" w:hAnsi="Arial" w:cs="Arial"/>
+          <w:color w:val="2F5496" w:themeColor="accent1" w:themeShade="BF"/>
+          <w:kern w:val="0"/>
+          <w:sz w:val="20"/>
+          <w:szCs w:val="20"/>
+          <w:lang w:eastAsia="it-IT"/>
+          <w14:ligatures w14:val="none"/>
+        </w:rPr>
+        <w:t xml:space="preserve">"Programma avviato", </w:t>
       </w:r>
       <w:proofErr w:type="spellStart"/>
       <w:r>
@@ -6126,6 +6277,7 @@
         <w:t xml:space="preserve">Alla riga del </w:t>
       </w:r>
       <w:proofErr w:type="spellStart"/>
+      <w:proofErr w:type="gramStart"/>
       <w:r>
         <w:rPr>
           <w:rFonts w:ascii="Courier New" w:eastAsia="Times New Roman" w:hAnsi="Courier New" w:cs="Courier New"/>
@@ -6151,7 +6303,21 @@
           <w:lang w:eastAsia="it-IT"/>
           <w14:ligatures w14:val="none"/>
         </w:rPr>
-        <w:t>()</w:t>
+        <w:t>(</w:t>
+      </w:r>
+      <w:proofErr w:type="gramEnd"/>
+      <w:r>
+        <w:rPr>
+          <w:rFonts w:ascii="Courier New" w:eastAsia="Times New Roman" w:hAnsi="Courier New" w:cs="Courier New"/>
+          <w:color w:val="2F5496" w:themeColor="accent1" w:themeShade="BF"/>
+          <w:kern w:val="0"/>
+          <w:sz w:val="20"/>
+          <w:szCs w:val="20"/>
+          <w:shd w:val="clear" w:color="auto" w:fill="F2F0F0"/>
+          <w:lang w:eastAsia="it-IT"/>
+          <w14:ligatures w14:val="none"/>
+        </w:rPr>
+        <w:t>)</w:t>
       </w:r>
       <w:r>
         <w:rPr>
@@ -6648,6 +6814,7 @@
         <w:t xml:space="preserve"> nel </w:t>
       </w:r>
       <w:proofErr w:type="spellStart"/>
+      <w:proofErr w:type="gramStart"/>
       <w:r>
         <w:rPr>
           <w:rFonts w:ascii="Courier New" w:eastAsia="Times New Roman" w:hAnsi="Courier New" w:cs="Courier New"/>
@@ -6673,7 +6840,21 @@
           <w:lang w:eastAsia="it-IT"/>
           <w14:ligatures w14:val="none"/>
         </w:rPr>
-        <w:t>()</w:t>
+        <w:t>(</w:t>
+      </w:r>
+      <w:proofErr w:type="gramEnd"/>
+      <w:r>
+        <w:rPr>
+          <w:rFonts w:ascii="Courier New" w:eastAsia="Times New Roman" w:hAnsi="Courier New" w:cs="Courier New"/>
+          <w:color w:val="2F5496" w:themeColor="accent1" w:themeShade="BF"/>
+          <w:kern w:val="0"/>
+          <w:sz w:val="20"/>
+          <w:szCs w:val="20"/>
+          <w:shd w:val="clear" w:color="auto" w:fill="F2F0F0"/>
+          <w:lang w:eastAsia="it-IT"/>
+          <w14:ligatures w14:val="none"/>
+        </w:rPr>
+        <w:t>)</w:t>
       </w:r>
       <w:r>
         <w:rPr>
@@ -6830,6 +7011,7 @@
         </w:rPr>
       </w:pPr>
       <w:proofErr w:type="spellStart"/>
+      <w:proofErr w:type="gramStart"/>
       <w:r>
         <w:rPr>
           <w:rFonts w:ascii="Courier New" w:eastAsia="Times New Roman" w:hAnsi="Courier New" w:cs="Courier New"/>
@@ -6840,7 +7022,20 @@
           <w:lang w:eastAsia="it-IT"/>
           <w14:ligatures w14:val="none"/>
         </w:rPr>
-        <w:t>os.path.dirname</w:t>
+        <w:t>os.path</w:t>
+      </w:r>
+      <w:proofErr w:type="gramEnd"/>
+      <w:r>
+        <w:rPr>
+          <w:rFonts w:ascii="Courier New" w:eastAsia="Times New Roman" w:hAnsi="Courier New" w:cs="Courier New"/>
+          <w:color w:val="2F5496" w:themeColor="accent1" w:themeShade="BF"/>
+          <w:kern w:val="0"/>
+          <w:sz w:val="20"/>
+          <w:szCs w:val="20"/>
+          <w:lang w:eastAsia="it-IT"/>
+          <w14:ligatures w14:val="none"/>
+        </w:rPr>
+        <w:t>.dirname</w:t>
       </w:r>
       <w:proofErr w:type="spellEnd"/>
       <w:r>
@@ -7016,6 +7211,7 @@
         <w:t xml:space="preserve">), che su Windows funzionano ma su Linux o Mac potrebbero rompersi, si usa la funzione </w:t>
       </w:r>
       <w:proofErr w:type="spellStart"/>
+      <w:proofErr w:type="gramStart"/>
       <w:r>
         <w:rPr>
           <w:rFonts w:ascii="Courier New" w:eastAsia="Times New Roman" w:hAnsi="Courier New" w:cs="Courier New"/>
@@ -7027,7 +7223,35 @@
           <w:lang w:eastAsia="it-IT"/>
           <w14:ligatures w14:val="none"/>
         </w:rPr>
-        <w:t>os.path.join</w:t>
+        <w:t>os.path</w:t>
+      </w:r>
+      <w:proofErr w:type="gramEnd"/>
+      <w:r>
+        <w:rPr>
+          <w:rFonts w:ascii="Courier New" w:eastAsia="Times New Roman" w:hAnsi="Courier New" w:cs="Courier New"/>
+          <w:color w:val="2F5496" w:themeColor="accent1" w:themeShade="BF"/>
+          <w:kern w:val="0"/>
+          <w:sz w:val="20"/>
+          <w:szCs w:val="20"/>
+          <w:shd w:val="clear" w:color="auto" w:fill="F2F0F0"/>
+          <w:lang w:eastAsia="it-IT"/>
+          <w14:ligatures w14:val="none"/>
+        </w:rPr>
+        <w:t>.</w:t>
+      </w:r>
+      <w:proofErr w:type="gramStart"/>
+      <w:r>
+        <w:rPr>
+          <w:rFonts w:ascii="Courier New" w:eastAsia="Times New Roman" w:hAnsi="Courier New" w:cs="Courier New"/>
+          <w:color w:val="2F5496" w:themeColor="accent1" w:themeShade="BF"/>
+          <w:kern w:val="0"/>
+          <w:sz w:val="20"/>
+          <w:szCs w:val="20"/>
+          <w:shd w:val="clear" w:color="auto" w:fill="F2F0F0"/>
+          <w:lang w:eastAsia="it-IT"/>
+          <w14:ligatures w14:val="none"/>
+        </w:rPr>
+        <w:t>join</w:t>
       </w:r>
       <w:proofErr w:type="spellEnd"/>
       <w:r>
@@ -7041,7 +7265,21 @@
           <w:lang w:eastAsia="it-IT"/>
           <w14:ligatures w14:val="none"/>
         </w:rPr>
-        <w:t>()</w:t>
+        <w:t>(</w:t>
+      </w:r>
+      <w:proofErr w:type="gramEnd"/>
+      <w:r>
+        <w:rPr>
+          <w:rFonts w:ascii="Courier New" w:eastAsia="Times New Roman" w:hAnsi="Courier New" w:cs="Courier New"/>
+          <w:color w:val="2F5496" w:themeColor="accent1" w:themeShade="BF"/>
+          <w:kern w:val="0"/>
+          <w:sz w:val="20"/>
+          <w:szCs w:val="20"/>
+          <w:shd w:val="clear" w:color="auto" w:fill="F2F0F0"/>
+          <w:lang w:eastAsia="it-IT"/>
+          <w14:ligatures w14:val="none"/>
+        </w:rPr>
+        <w:t>)</w:t>
       </w:r>
       <w:r>
         <w:rPr>
@@ -7541,6 +7779,7 @@
         <w:t xml:space="preserve"> (usando </w:t>
       </w:r>
       <w:proofErr w:type="spellStart"/>
+      <w:proofErr w:type="gramStart"/>
       <w:r>
         <w:rPr>
           <w:rFonts w:ascii="Courier New" w:eastAsia="Times New Roman" w:hAnsi="Courier New" w:cs="Courier New"/>
@@ -7552,7 +7791,21 @@
           <w:lang w:eastAsia="it-IT"/>
           <w14:ligatures w14:val="none"/>
         </w:rPr>
-        <w:t>os.path.dirname</w:t>
+        <w:t>os.path</w:t>
+      </w:r>
+      <w:proofErr w:type="gramEnd"/>
+      <w:r>
+        <w:rPr>
+          <w:rFonts w:ascii="Courier New" w:eastAsia="Times New Roman" w:hAnsi="Courier New" w:cs="Courier New"/>
+          <w:color w:val="2F5496" w:themeColor="accent1" w:themeShade="BF"/>
+          <w:kern w:val="0"/>
+          <w:sz w:val="20"/>
+          <w:szCs w:val="20"/>
+          <w:shd w:val="clear" w:color="auto" w:fill="F2F0F0"/>
+          <w:lang w:eastAsia="it-IT"/>
+          <w14:ligatures w14:val="none"/>
+        </w:rPr>
+        <w:t>.dirname</w:t>
       </w:r>
       <w:proofErr w:type="spellEnd"/>
       <w:r>
@@ -7888,6 +8141,7 @@
         <w:t xml:space="preserve"> = </w:t>
       </w:r>
       <w:proofErr w:type="spellStart"/>
+      <w:proofErr w:type="gramStart"/>
       <w:r>
         <w:rPr>
           <w:rFonts w:ascii="Courier New" w:eastAsia="Times New Roman" w:hAnsi="Courier New" w:cs="Courier New"/>
@@ -7898,7 +8152,20 @@
           <w:lang w:eastAsia="it-IT"/>
           <w14:ligatures w14:val="none"/>
         </w:rPr>
-        <w:t>os.path.dirname</w:t>
+        <w:t>os.path</w:t>
+      </w:r>
+      <w:proofErr w:type="gramEnd"/>
+      <w:r>
+        <w:rPr>
+          <w:rFonts w:ascii="Courier New" w:eastAsia="Times New Roman" w:hAnsi="Courier New" w:cs="Courier New"/>
+          <w:color w:val="2F5496" w:themeColor="accent1" w:themeShade="BF"/>
+          <w:kern w:val="0"/>
+          <w:sz w:val="20"/>
+          <w:szCs w:val="20"/>
+          <w:lang w:eastAsia="it-IT"/>
+          <w14:ligatures w14:val="none"/>
+        </w:rPr>
+        <w:t>.dirname</w:t>
       </w:r>
       <w:proofErr w:type="spellEnd"/>
       <w:r>
@@ -7973,6 +8240,7 @@
         <w:t xml:space="preserve"> = </w:t>
       </w:r>
       <w:proofErr w:type="spellStart"/>
+      <w:proofErr w:type="gramStart"/>
       <w:r>
         <w:rPr>
           <w:rFonts w:ascii="Courier New" w:eastAsia="Times New Roman" w:hAnsi="Courier New" w:cs="Courier New"/>
@@ -7983,7 +8251,33 @@
           <w:lang w:eastAsia="it-IT"/>
           <w14:ligatures w14:val="none"/>
         </w:rPr>
-        <w:t>os.path.join</w:t>
+        <w:t>os.path</w:t>
+      </w:r>
+      <w:proofErr w:type="gramEnd"/>
+      <w:r>
+        <w:rPr>
+          <w:rFonts w:ascii="Courier New" w:eastAsia="Times New Roman" w:hAnsi="Courier New" w:cs="Courier New"/>
+          <w:color w:val="2F5496" w:themeColor="accent1" w:themeShade="BF"/>
+          <w:kern w:val="0"/>
+          <w:sz w:val="20"/>
+          <w:szCs w:val="20"/>
+          <w:lang w:eastAsia="it-IT"/>
+          <w14:ligatures w14:val="none"/>
+        </w:rPr>
+        <w:t>.</w:t>
+      </w:r>
+      <w:proofErr w:type="gramStart"/>
+      <w:r>
+        <w:rPr>
+          <w:rFonts w:ascii="Courier New" w:eastAsia="Times New Roman" w:hAnsi="Courier New" w:cs="Courier New"/>
+          <w:color w:val="2F5496" w:themeColor="accent1" w:themeShade="BF"/>
+          <w:kern w:val="0"/>
+          <w:sz w:val="20"/>
+          <w:szCs w:val="20"/>
+          <w:lang w:eastAsia="it-IT"/>
+          <w14:ligatures w14:val="none"/>
+        </w:rPr>
+        <w:t>join</w:t>
       </w:r>
       <w:proofErr w:type="spellEnd"/>
       <w:r>
@@ -7999,6 +8293,7 @@
         <w:t>(</w:t>
       </w:r>
       <w:proofErr w:type="spellStart"/>
+      <w:proofErr w:type="gramEnd"/>
       <w:r>
         <w:rPr>
           <w:rFonts w:ascii="Courier New" w:eastAsia="Times New Roman" w:hAnsi="Courier New" w:cs="Courier New"/>
@@ -8051,6 +8346,7 @@
         <w:t xml:space="preserve">Secondo voi, se sostituite la vecchia riga del </w:t>
       </w:r>
       <w:proofErr w:type="spellStart"/>
+      <w:proofErr w:type="gramStart"/>
       <w:r>
         <w:rPr>
           <w:rFonts w:ascii="Courier New" w:eastAsia="Times New Roman" w:hAnsi="Courier New" w:cs="Courier New"/>
@@ -8076,7 +8372,21 @@
           <w:lang w:eastAsia="it-IT"/>
           <w14:ligatures w14:val="none"/>
         </w:rPr>
-        <w:t>()</w:t>
+        <w:t>(</w:t>
+      </w:r>
+      <w:proofErr w:type="gramEnd"/>
+      <w:r>
+        <w:rPr>
+          <w:rFonts w:ascii="Courier New" w:eastAsia="Times New Roman" w:hAnsi="Courier New" w:cs="Courier New"/>
+          <w:color w:val="2F5496" w:themeColor="accent1" w:themeShade="BF"/>
+          <w:kern w:val="0"/>
+          <w:sz w:val="20"/>
+          <w:szCs w:val="20"/>
+          <w:shd w:val="clear" w:color="auto" w:fill="F2F0F0"/>
+          <w:lang w:eastAsia="it-IT"/>
+          <w14:ligatures w14:val="none"/>
+        </w:rPr>
+        <w:t>)</w:t>
       </w:r>
       <w:r>
         <w:rPr>
@@ -8601,8 +8911,22 @@
           <w:lang w:eastAsia="it-IT"/>
           <w14:ligatures w14:val="none"/>
         </w:rPr>
-        <w:t xml:space="preserve"> qui sotto la conversazione..</w:t>
-      </w:r>
+        <w:t xml:space="preserve"> qui sotto la </w:t>
+      </w:r>
+      <w:proofErr w:type="gramStart"/>
+      <w:r>
+        <w:rPr>
+          <w:rFonts w:eastAsia="Times New Roman" w:cstheme="minorHAnsi"/>
+          <w:color w:val="000000" w:themeColor="text1"/>
+          <w:kern w:val="0"/>
+          <w:sz w:val="20"/>
+          <w:szCs w:val="20"/>
+          <w:lang w:eastAsia="it-IT"/>
+          <w14:ligatures w14:val="none"/>
+        </w:rPr>
+        <w:t>conversazione..</w:t>
+      </w:r>
+      <w:proofErr w:type="gramEnd"/>
     </w:p>
     <w:p>
       <w:pPr>
@@ -8829,8 +9153,24 @@
           <w:lang w:eastAsia="it-IT"/>
           <w14:ligatures w14:val="none"/>
         </w:rPr>
-        <w:t xml:space="preserve"> che sembrava non tornare..</w:t>
-      </w:r>
+        <w:t xml:space="preserve"> che sembrava non </w:t>
+      </w:r>
+      <w:proofErr w:type="gramStart"/>
+      <w:r>
+        <w:rPr>
+          <w:rFonts w:eastAsia="Times New Roman" w:cstheme="minorHAnsi"/>
+          <w:i/>
+          <w:iCs/>
+          <w:color w:val="222222"/>
+          <w:kern w:val="0"/>
+          <w:sz w:val="18"/>
+          <w:szCs w:val="18"/>
+          <w:lang w:eastAsia="it-IT"/>
+          <w14:ligatures w14:val="none"/>
+        </w:rPr>
+        <w:t>tornare..</w:t>
+      </w:r>
+      <w:proofErr w:type="gramEnd"/>
     </w:p>
     <w:p>
       <w:pPr>
@@ -9476,8 +9816,18 @@
           <w:sz w:val="20"/>
           <w:szCs w:val="20"/>
         </w:rPr>
-        <w:t xml:space="preserve"> tipo :</w:t>
-      </w:r>
+        <w:t xml:space="preserve"> </w:t>
+      </w:r>
+      <w:proofErr w:type="gramStart"/>
+      <w:r>
+        <w:rPr>
+          <w:rFonts w:cstheme="minorHAnsi"/>
+          <w:sz w:val="20"/>
+          <w:szCs w:val="20"/>
+        </w:rPr>
+        <w:t>tipo :</w:t>
+      </w:r>
+      <w:proofErr w:type="gramEnd"/>
     </w:p>
     <w:p>
       <w:pPr>
@@ -9556,7 +9906,15 @@
           <w:rStyle w:val="m"/>
           <w:rFonts w:cstheme="minorHAnsi"/>
         </w:rPr>
-        <w:t>monitora_cartella</w:t>
+        <w:t>monitora_</w:t>
+      </w:r>
+      <w:proofErr w:type="gramStart"/>
+      <w:r>
+        <w:rPr>
+          <w:rStyle w:val="m"/>
+          <w:rFonts w:cstheme="minorHAnsi"/>
+        </w:rPr>
+        <w:t>cartella</w:t>
       </w:r>
       <w:proofErr w:type="spellEnd"/>
       <w:r>
@@ -9566,6 +9924,7 @@
         <w:t>(</w:t>
       </w:r>
       <w:proofErr w:type="spellStart"/>
+      <w:proofErr w:type="gramEnd"/>
       <w:r>
         <w:rPr>
           <w:rStyle w:val="m"/>
@@ -9669,7 +10028,15 @@
           <w:rStyle w:val="m"/>
           <w:rFonts w:cstheme="minorHAnsi"/>
         </w:rPr>
-        <w:t>scrivi_log</w:t>
+        <w:t>scrivi_</w:t>
+      </w:r>
+      <w:proofErr w:type="gramStart"/>
+      <w:r>
+        <w:rPr>
+          <w:rStyle w:val="m"/>
+          <w:rFonts w:cstheme="minorHAnsi"/>
+        </w:rPr>
+        <w:t>log</w:t>
       </w:r>
       <w:proofErr w:type="spellEnd"/>
       <w:r>
@@ -9678,6 +10045,7 @@
         </w:rPr>
         <w:t>(</w:t>
       </w:r>
+      <w:proofErr w:type="gramEnd"/>
       <w:r>
         <w:rPr>
           <w:rStyle w:val="k"/>
@@ -9713,6 +10081,7 @@
         <w:br/>
       </w:r>
       <w:proofErr w:type="spellStart"/>
+      <w:proofErr w:type="gramStart"/>
       <w:r>
         <w:rPr>
           <w:rStyle w:val="m"/>
@@ -9727,6 +10096,7 @@
         </w:rPr>
         <w:t>(</w:t>
       </w:r>
+      <w:proofErr w:type="gramEnd"/>
       <w:r>
         <w:rPr>
           <w:rStyle w:val="k"/>
@@ -10045,7 +10415,25 @@
           <w:sz w:val="20"/>
           <w:szCs w:val="20"/>
         </w:rPr>
-        <w:t>ore 09:15  26/05/2026</w:t>
+        <w:t xml:space="preserve">ore </w:t>
+      </w:r>
+      <w:proofErr w:type="gramStart"/>
+      <w:r>
+        <w:rPr>
+          <w:rFonts w:cstheme="minorHAnsi"/>
+          <w:sz w:val="20"/>
+          <w:szCs w:val="20"/>
+        </w:rPr>
+        <w:t>09:15  26</w:t>
+      </w:r>
+      <w:proofErr w:type="gramEnd"/>
+      <w:r>
+        <w:rPr>
+          <w:rFonts w:cstheme="minorHAnsi"/>
+          <w:sz w:val="20"/>
+          <w:szCs w:val="20"/>
+        </w:rPr>
+        <w:t>/05/2026</w:t>
       </w:r>
     </w:p>
     <w:p>
@@ -10400,7 +10788,16 @@
           <w:sz w:val="20"/>
           <w:szCs w:val="20"/>
         </w:rPr>
-        <w:t>percorsi_conf</w:t>
+        <w:t>percorsi_</w:t>
+      </w:r>
+      <w:proofErr w:type="gramStart"/>
+      <w:r>
+        <w:rPr>
+          <w:rFonts w:cstheme="minorHAnsi"/>
+          <w:sz w:val="20"/>
+          <w:szCs w:val="20"/>
+        </w:rPr>
+        <w:t>conf</w:t>
       </w:r>
       <w:proofErr w:type="spellEnd"/>
       <w:r>
@@ -10409,7 +10806,16 @@
           <w:sz w:val="20"/>
           <w:szCs w:val="20"/>
         </w:rPr>
-        <w:t>()</w:t>
+        <w:t>(</w:t>
+      </w:r>
+      <w:proofErr w:type="gramEnd"/>
+      <w:r>
+        <w:rPr>
+          <w:rFonts w:cstheme="minorHAnsi"/>
+          <w:sz w:val="20"/>
+          <w:szCs w:val="20"/>
+        </w:rPr>
+        <w:t>)</w:t>
       </w:r>
     </w:p>
     <w:p>
@@ -10654,13 +11060,23 @@
           <w:szCs w:val="20"/>
         </w:rPr>
       </w:pPr>
-      <w:r>
-        <w:rPr>
-          <w:rFonts w:cstheme="minorHAnsi"/>
-          <w:sz w:val="20"/>
-          <w:szCs w:val="20"/>
-        </w:rPr>
-        <w:t>backup()</w:t>
+      <w:proofErr w:type="gramStart"/>
+      <w:r>
+        <w:rPr>
+          <w:rFonts w:cstheme="minorHAnsi"/>
+          <w:sz w:val="20"/>
+          <w:szCs w:val="20"/>
+        </w:rPr>
+        <w:t>backup(</w:t>
+      </w:r>
+      <w:proofErr w:type="gramEnd"/>
+      <w:r>
+        <w:rPr>
+          <w:rFonts w:cstheme="minorHAnsi"/>
+          <w:sz w:val="20"/>
+          <w:szCs w:val="20"/>
+        </w:rPr>
+        <w:t>)</w:t>
       </w:r>
     </w:p>
     <w:p>
@@ -11291,7 +11707,30 @@
           <w14:ligatures w14:val="none"/>
         </w:rPr>
         <w:br/>
-        <w:t>backup()</w:t>
+      </w:r>
+      <w:proofErr w:type="gramStart"/>
+      <w:r>
+        <w:rPr>
+          <w:rFonts w:eastAsia="Times New Roman" w:cstheme="minorHAnsi"/>
+          <w:kern w:val="0"/>
+          <w:sz w:val="20"/>
+          <w:szCs w:val="20"/>
+          <w:lang w:eastAsia="it-IT"/>
+          <w14:ligatures w14:val="none"/>
+        </w:rPr>
+        <w:t>backup(</w:t>
+      </w:r>
+      <w:proofErr w:type="gramEnd"/>
+      <w:r>
+        <w:rPr>
+          <w:rFonts w:eastAsia="Times New Roman" w:cstheme="minorHAnsi"/>
+          <w:kern w:val="0"/>
+          <w:sz w:val="20"/>
+          <w:szCs w:val="20"/>
+          <w:lang w:eastAsia="it-IT"/>
+          <w14:ligatures w14:val="none"/>
+        </w:rPr>
+        <w:t>)</w:t>
       </w:r>
       <w:r>
         <w:rPr>
@@ -12136,7 +12575,23 @@
           <w:b/>
           <w:bCs/>
         </w:rPr>
-        <w:t>fine sessione 7  ***************</w:t>
+        <w:t xml:space="preserve">fine sessione </w:t>
+      </w:r>
+      <w:proofErr w:type="gramStart"/>
+      <w:r>
+        <w:rPr>
+          <w:b/>
+          <w:bCs/>
+        </w:rPr>
+        <w:t>7  *</w:t>
+      </w:r>
+      <w:proofErr w:type="gramEnd"/>
+      <w:r>
+        <w:rPr>
+          <w:b/>
+          <w:bCs/>
+        </w:rPr>
+        <w:t>**************</w:t>
       </w:r>
     </w:p>
     <w:p>
@@ -12764,19 +13219,28 @@
         <w:t>="</w:t>
       </w:r>
       <w:proofErr w:type="spellStart"/>
+      <w:proofErr w:type="gramStart"/>
       <w:r>
         <w:rPr>
           <w:b/>
           <w:bCs/>
         </w:rPr>
-        <w:t>clienti,preventivi,amministrazione</w:t>
-      </w:r>
-      <w:proofErr w:type="spellEnd"/>
+        <w:t>clienti,preventivi</w:t>
+      </w:r>
+      <w:proofErr w:type="gramEnd"/>
       <w:r>
         <w:rPr>
           <w:b/>
           <w:bCs/>
         </w:rPr>
+        <w:t>,amministrazione</w:t>
+      </w:r>
+      <w:proofErr w:type="spellEnd"/>
+      <w:r>
+        <w:rPr>
+          <w:b/>
+          <w:bCs/>
+        </w:rPr>
         <w:t>"</w:t>
       </w:r>
     </w:p>
@@ -12786,7 +13250,15 @@
       </w:pPr>
       <w:r>
         <w:tab/>
-        <w:t xml:space="preserve">dove dopo “ =” </w:t>
+        <w:t xml:space="preserve">dove dopo </w:t>
+      </w:r>
+      <w:proofErr w:type="gramStart"/>
+      <w:r>
+        <w:t>“ =</w:t>
+      </w:r>
+      <w:proofErr w:type="gramEnd"/>
+      <w:r>
+        <w:t xml:space="preserve">” </w:t>
       </w:r>
       <w:proofErr w:type="spellStart"/>
       <w:r>
@@ -12802,8 +13274,13 @@
       </w:r>
       <w:proofErr w:type="spellEnd"/>
       <w:r>
-        <w:t xml:space="preserve"> elencare le cartelle..</w:t>
-      </w:r>
+        <w:t xml:space="preserve"> elencare le </w:t>
+      </w:r>
+      <w:proofErr w:type="gramStart"/>
+      <w:r>
+        <w:t>cartelle..</w:t>
+      </w:r>
+      <w:proofErr w:type="gramEnd"/>
     </w:p>
     <w:p>
       <w:pPr>
@@ -12890,6 +13367,59 @@
         <w:tab/>
         <w:t>ignora righe prive del carattere =.</w:t>
       </w:r>
+    </w:p>
+    <w:p>
+      <w:pPr>
+        <w:spacing w:after="0" w:line="240" w:lineRule="auto"/>
+      </w:pPr>
+    </w:p>
+    <w:p>
+      <w:pPr>
+        <w:spacing w:after="0" w:line="240" w:lineRule="auto"/>
+      </w:pPr>
+      <w:r>
+        <w:t xml:space="preserve">Durante l'ultima revisione del progetto è stata aggiornata la documentazione tecnica per allinearla alla </w:t>
+      </w:r>
+      <w:r>
+        <w:rPr>
+          <w:b/>
+          <w:bCs/>
+        </w:rPr>
+        <w:t>versione software 3.2</w:t>
+      </w:r>
+      <w:r>
+        <w:t xml:space="preserve">. </w:t>
+      </w:r>
+    </w:p>
+    <w:p>
+      <w:pPr>
+        <w:spacing w:after="0" w:line="240" w:lineRule="auto"/>
+      </w:pPr>
+    </w:p>
+    <w:p>
+      <w:pPr>
+        <w:spacing w:after="0" w:line="240" w:lineRule="auto"/>
+      </w:pPr>
+      <w:r>
+        <w:t xml:space="preserve">Sono state documentate le nuove funzionalità di configurazione tramite file </w:t>
+      </w:r>
+      <w:proofErr w:type="spellStart"/>
+      <w:r>
+        <w:rPr>
+          <w:rStyle w:val="CodiceHTML"/>
+          <w:rFonts w:eastAsiaTheme="majorEastAsia"/>
+        </w:rPr>
+        <w:t>conf.conf</w:t>
+      </w:r>
+      <w:proofErr w:type="spellEnd"/>
+      <w:r>
+        <w:t xml:space="preserve">, il monitoraggio selettivo delle sottocartelle, il sistema di backup che mantiene la struttura originale delle directory e la gestione degli errori durante le operazioni di copia. </w:t>
+      </w:r>
+    </w:p>
+    <w:p>
+      <w:pPr>
+        <w:spacing w:after="0" w:line="240" w:lineRule="auto"/>
+      </w:pPr>
     </w:p>
     <w:p>
       <w:pPr>

</xml_diff>